<commit_message>
Add manuscript figures and molecular structure panels
</commit_message>
<xml_diff>
--- a/outputs/submission/submission_manuscript.docx
+++ b/outputs/submission/submission_manuscript.docx
@@ -149,6 +149,60 @@
     <w:p>
       <w:r>
         <w:t>The aim of the present study was to assemble, audit, and report an end-to-end computational discovery workflow for MDR-TB that remains tightly grounded in exported outputs. The pipeline integrates disease-context modules, resistance-informed target prioritization, compound generation, docking, machine-learning support, and post-docking triage. The resulting manuscript is intended to document a reproducible in silico lead-nomination process rather than to claim biological validation.</w:t>
+      </w:r>
+    </w:p>
+    <w:p/>
+    <w:p>
+      <w:pPr>
+        <w:jc w:val="center"/>
+      </w:pPr>
+      <w:r>
+        <w:drawing>
+          <wp:inline xmlns:a="http://schemas.openxmlformats.org/drawingml/2006/main" xmlns:pic="http://schemas.openxmlformats.org/drawingml/2006/picture">
+            <wp:extent cx="5669280" cy="1865314"/>
+            <wp:docPr id="1" name="Picture 1"/>
+            <wp:cNvGraphicFramePr>
+              <a:graphicFrameLocks noChangeAspect="1"/>
+            </wp:cNvGraphicFramePr>
+            <a:graphic>
+              <a:graphicData uri="http://schemas.openxmlformats.org/drawingml/2006/picture">
+                <pic:pic>
+                  <pic:nvPicPr>
+                    <pic:cNvPr id="0" name="figure_1_workflow.png"/>
+                    <pic:cNvPicPr/>
+                  </pic:nvPicPr>
+                  <pic:blipFill>
+                    <a:blip r:embed="rId9"/>
+                    <a:stretch>
+                      <a:fillRect/>
+                    </a:stretch>
+                  </pic:blipFill>
+                  <pic:spPr>
+                    <a:xfrm>
+                      <a:off x="0" y="0"/>
+                      <a:ext cx="5669280" cy="1865314"/>
+                    </a:xfrm>
+                    <a:prstGeom prst="rect"/>
+                  </pic:spPr>
+                </pic:pic>
+              </a:graphicData>
+            </a:graphic>
+          </wp:inline>
+        </w:drawing>
+      </w:r>
+    </w:p>
+    <w:p>
+      <w:pPr>
+        <w:jc w:val="center"/>
+      </w:pPr>
+      <w:r>
+        <w:t>Figure 1. Computational workflow for MDR-TB lead prioritization</w:t>
+      </w:r>
+    </w:p>
+    <w:p/>
+    <w:p>
+      <w:r>
+        <w:t>Figure 1. Computational workflow linking data ingestion, target prioritization, de novo generation, docking, post-docking triage, retrosynthesis, and manuscript generation.</w:t>
       </w:r>
     </w:p>
     <w:p/>
@@ -404,6 +458,60 @@
     </w:p>
     <w:p/>
     <w:p>
+      <w:pPr>
+        <w:jc w:val="center"/>
+      </w:pPr>
+      <w:r>
+        <w:drawing>
+          <wp:inline xmlns:a="http://schemas.openxmlformats.org/drawingml/2006/main" xmlns:pic="http://schemas.openxmlformats.org/drawingml/2006/picture">
+            <wp:extent cx="5669280" cy="3120120"/>
+            <wp:docPr id="2" name="Picture 2"/>
+            <wp:cNvGraphicFramePr>
+              <a:graphicFrameLocks noChangeAspect="1"/>
+            </wp:cNvGraphicFramePr>
+            <a:graphic>
+              <a:graphicData uri="http://schemas.openxmlformats.org/drawingml/2006/picture">
+                <pic:pic>
+                  <pic:nvPicPr>
+                    <pic:cNvPr id="0" name="figure_3_mdr_patterns.png"/>
+                    <pic:cNvPicPr/>
+                  </pic:nvPicPr>
+                  <pic:blipFill>
+                    <a:blip r:embed="rId10"/>
+                    <a:stretch>
+                      <a:fillRect/>
+                    </a:stretch>
+                  </pic:blipFill>
+                  <pic:spPr>
+                    <a:xfrm>
+                      <a:off x="0" y="0"/>
+                      <a:ext cx="5669280" cy="3120120"/>
+                    </a:xfrm>
+                    <a:prstGeom prst="rect"/>
+                  </pic:spPr>
+                </pic:pic>
+              </a:graphicData>
+            </a:graphic>
+          </wp:inline>
+        </w:drawing>
+      </w:r>
+    </w:p>
+    <w:p>
+      <w:pPr>
+        <w:jc w:val="center"/>
+      </w:pPr>
+      <w:r>
+        <w:t>Figure 2. Regional MDR-TB burden patterns</w:t>
+      </w:r>
+    </w:p>
+    <w:p/>
+    <w:p>
+      <w:r>
+        <w:t>Figure 2. Regional MDR-TB burden patterns derived from the epidemiology module, showing latest MDR-TB percentage across analyzed regions.</w:t>
+      </w:r>
+    </w:p>
+    <w:p/>
+    <w:p>
       <w:r>
         <w:rPr>
           <w:b/>
@@ -422,6 +530,60 @@
     <w:p>
       <w:r>
         <w:t>Target prioritization identified InhA as the top-ranked target with final score 0.8695. Other highly ranked targets included RpoB, GyrA, EmbB, and Rrs. The top target list is shown in Table 1.</w:t>
+      </w:r>
+    </w:p>
+    <w:p/>
+    <w:p>
+      <w:pPr>
+        <w:jc w:val="center"/>
+      </w:pPr>
+      <w:r>
+        <w:drawing>
+          <wp:inline xmlns:a="http://schemas.openxmlformats.org/drawingml/2006/main" xmlns:pic="http://schemas.openxmlformats.org/drawingml/2006/picture">
+            <wp:extent cx="5669280" cy="3523565"/>
+            <wp:docPr id="3" name="Picture 3"/>
+            <wp:cNvGraphicFramePr>
+              <a:graphicFrameLocks noChangeAspect="1"/>
+            </wp:cNvGraphicFramePr>
+            <a:graphic>
+              <a:graphicData uri="http://schemas.openxmlformats.org/drawingml/2006/picture">
+                <pic:pic>
+                  <pic:nvPicPr>
+                    <pic:cNvPr id="0" name="figure_2_target_ranking.png"/>
+                    <pic:cNvPicPr/>
+                  </pic:nvPicPr>
+                  <pic:blipFill>
+                    <a:blip r:embed="rId11"/>
+                    <a:stretch>
+                      <a:fillRect/>
+                    </a:stretch>
+                  </pic:blipFill>
+                  <pic:spPr>
+                    <a:xfrm>
+                      <a:off x="0" y="0"/>
+                      <a:ext cx="5669280" cy="3523565"/>
+                    </a:xfrm>
+                    <a:prstGeom prst="rect"/>
+                  </pic:spPr>
+                </pic:pic>
+              </a:graphicData>
+            </a:graphic>
+          </wp:inline>
+        </w:drawing>
+      </w:r>
+    </w:p>
+    <w:p>
+      <w:pPr>
+        <w:jc w:val="center"/>
+      </w:pPr>
+      <w:r>
+        <w:t>Figure 3. Top-ranked TB drug targets</w:t>
+      </w:r>
+    </w:p>
+    <w:p/>
+    <w:p>
+      <w:r>
+        <w:t>Figure 3. Horizontal ranking of the top prioritized TB drug targets based on the exported multi-factor scoring table.</w:t>
       </w:r>
     </w:p>
     <w:p/>
@@ -783,6 +945,114 @@
     <w:p>
       <w:r>
         <w:t>Docking results against InhA showed a leading cluster of compounds with substantially stronger predicted affinities than the repeated -4.0 kcal/mol plateau seen among many lower-ranked compounds. The top 10 docked compounds are shown in Table 2.</w:t>
+      </w:r>
+    </w:p>
+    <w:p/>
+    <w:p>
+      <w:pPr>
+        <w:jc w:val="center"/>
+      </w:pPr>
+      <w:r>
+        <w:drawing>
+          <wp:inline xmlns:a="http://schemas.openxmlformats.org/drawingml/2006/main" xmlns:pic="http://schemas.openxmlformats.org/drawingml/2006/picture">
+            <wp:extent cx="5669280" cy="3130004"/>
+            <wp:docPr id="4" name="Picture 4"/>
+            <wp:cNvGraphicFramePr>
+              <a:graphicFrameLocks noChangeAspect="1"/>
+            </wp:cNvGraphicFramePr>
+            <a:graphic>
+              <a:graphicData uri="http://schemas.openxmlformats.org/drawingml/2006/picture">
+                <pic:pic>
+                  <pic:nvPicPr>
+                    <pic:cNvPr id="0" name="figure_4_pathways.png"/>
+                    <pic:cNvPicPr/>
+                  </pic:nvPicPr>
+                  <pic:blipFill>
+                    <a:blip r:embed="rId12"/>
+                    <a:stretch>
+                      <a:fillRect/>
+                    </a:stretch>
+                  </pic:blipFill>
+                  <pic:spPr>
+                    <a:xfrm>
+                      <a:off x="0" y="0"/>
+                      <a:ext cx="5669280" cy="3130004"/>
+                    </a:xfrm>
+                    <a:prstGeom prst="rect"/>
+                  </pic:spPr>
+                </pic:pic>
+              </a:graphicData>
+            </a:graphic>
+          </wp:inline>
+        </w:drawing>
+      </w:r>
+    </w:p>
+    <w:p>
+      <w:pPr>
+        <w:jc w:val="center"/>
+      </w:pPr>
+      <w:r>
+        <w:t>Figure 4. Top enriched pathways in the omics module</w:t>
+      </w:r>
+    </w:p>
+    <w:p/>
+    <w:p>
+      <w:r>
+        <w:t>Figure 4. Top enriched pathways from the omics module, highlighting glycolysis and related metabolic processes in the current computational run.</w:t>
+      </w:r>
+    </w:p>
+    <w:p/>
+    <w:p>
+      <w:pPr>
+        <w:jc w:val="center"/>
+      </w:pPr>
+      <w:r>
+        <w:drawing>
+          <wp:inline xmlns:a="http://schemas.openxmlformats.org/drawingml/2006/main" xmlns:pic="http://schemas.openxmlformats.org/drawingml/2006/picture">
+            <wp:extent cx="5669280" cy="3128831"/>
+            <wp:docPr id="5" name="Picture 5"/>
+            <wp:cNvGraphicFramePr>
+              <a:graphicFrameLocks noChangeAspect="1"/>
+            </wp:cNvGraphicFramePr>
+            <a:graphic>
+              <a:graphicData uri="http://schemas.openxmlformats.org/drawingml/2006/picture">
+                <pic:pic>
+                  <pic:nvPicPr>
+                    <pic:cNvPr id="0" name="figure_5_docking_hits.png"/>
+                    <pic:cNvPicPr/>
+                  </pic:nvPicPr>
+                  <pic:blipFill>
+                    <a:blip r:embed="rId13"/>
+                    <a:stretch>
+                      <a:fillRect/>
+                    </a:stretch>
+                  </pic:blipFill>
+                  <pic:spPr>
+                    <a:xfrm>
+                      <a:off x="0" y="0"/>
+                      <a:ext cx="5669280" cy="3128831"/>
+                    </a:xfrm>
+                    <a:prstGeom prst="rect"/>
+                  </pic:spPr>
+                </pic:pic>
+              </a:graphicData>
+            </a:graphic>
+          </wp:inline>
+        </w:drawing>
+      </w:r>
+    </w:p>
+    <w:p>
+      <w:pPr>
+        <w:jc w:val="center"/>
+      </w:pPr>
+      <w:r>
+        <w:t>Figure 5. Top docking hits against InhA</w:t>
+      </w:r>
+    </w:p>
+    <w:p/>
+    <w:p>
+      <w:r>
+        <w:t>Figure 5. Top docking hits against InhA ranked by predicted binding affinity.</w:t>
       </w:r>
     </w:p>
     <w:p/>
@@ -1426,6 +1696,60 @@
     </w:p>
     <w:p/>
     <w:p>
+      <w:pPr>
+        <w:jc w:val="center"/>
+      </w:pPr>
+      <w:r>
+        <w:drawing>
+          <wp:inline xmlns:a="http://schemas.openxmlformats.org/drawingml/2006/main" xmlns:pic="http://schemas.openxmlformats.org/drawingml/2006/picture">
+            <wp:extent cx="5669280" cy="3149600"/>
+            <wp:docPr id="6" name="Picture 6"/>
+            <wp:cNvGraphicFramePr>
+              <a:graphicFrameLocks noChangeAspect="1"/>
+            </wp:cNvGraphicFramePr>
+            <a:graphic>
+              <a:graphicData uri="http://schemas.openxmlformats.org/drawingml/2006/picture">
+                <pic:pic>
+                  <pic:nvPicPr>
+                    <pic:cNvPr id="0" name="figure_6_top_structures.png"/>
+                    <pic:cNvPicPr/>
+                  </pic:nvPicPr>
+                  <pic:blipFill>
+                    <a:blip r:embed="rId14"/>
+                    <a:stretch>
+                      <a:fillRect/>
+                    </a:stretch>
+                  </pic:blipFill>
+                  <pic:spPr>
+                    <a:xfrm>
+                      <a:off x="0" y="0"/>
+                      <a:ext cx="5669280" cy="3149600"/>
+                    </a:xfrm>
+                    <a:prstGeom prst="rect"/>
+                  </pic:spPr>
+                </pic:pic>
+              </a:graphicData>
+            </a:graphic>
+          </wp:inline>
+        </w:drawing>
+      </w:r>
+    </w:p>
+    <w:p>
+      <w:pPr>
+        <w:jc w:val="center"/>
+      </w:pPr>
+      <w:r>
+        <w:t>Figure 6. Top valid de novo molecular structures</w:t>
+      </w:r>
+    </w:p>
+    <w:p/>
+    <w:p>
+      <w:r>
+        <w:t>Figure 6. Two-dimensional molecular structure renderings for selected top valid de novo compounds identified in the ranking workflow (MDR_AI_030, MDR_AI_039, MDR_AI_047, MDR_AI_005, MDR_AI_026, and MDR_AI_042).</w:t>
+      </w:r>
+    </w:p>
+    <w:p/>
+    <w:p>
       <w:r>
         <w:t>Table 3. Integrated post-docking profile of MDR_AI_030</w:t>
       </w:r>
@@ -1681,6 +2005,60 @@
     <w:p>
       <w:r>
         <w:t>Machine-learning performance was modest but adequate for prioritization support. The best model was the random forest with ROC-AUC 0.7273, accuracy 0.650, precision 0.600, recall 0.667, and F1-score 0.632. Gradient boosting showed intermediate performance, while logistic regression performed substantially worse on the current task.</w:t>
+      </w:r>
+    </w:p>
+    <w:p/>
+    <w:p>
+      <w:pPr>
+        <w:jc w:val="center"/>
+      </w:pPr>
+      <w:r>
+        <w:drawing>
+          <wp:inline xmlns:a="http://schemas.openxmlformats.org/drawingml/2006/main" xmlns:pic="http://schemas.openxmlformats.org/drawingml/2006/picture">
+            <wp:extent cx="5669280" cy="3617175"/>
+            <wp:docPr id="7" name="Picture 7"/>
+            <wp:cNvGraphicFramePr>
+              <a:graphicFrameLocks noChangeAspect="1"/>
+            </wp:cNvGraphicFramePr>
+            <a:graphic>
+              <a:graphicData uri="http://schemas.openxmlformats.org/drawingml/2006/picture">
+                <pic:pic>
+                  <pic:nvPicPr>
+                    <pic:cNvPr id="0" name="figure_7_lead_profile.png"/>
+                    <pic:cNvPicPr/>
+                  </pic:nvPicPr>
+                  <pic:blipFill>
+                    <a:blip r:embed="rId15"/>
+                    <a:stretch>
+                      <a:fillRect/>
+                    </a:stretch>
+                  </pic:blipFill>
+                  <pic:spPr>
+                    <a:xfrm>
+                      <a:off x="0" y="0"/>
+                      <a:ext cx="5669280" cy="3617175"/>
+                    </a:xfrm>
+                    <a:prstGeom prst="rect"/>
+                  </pic:spPr>
+                </pic:pic>
+              </a:graphicData>
+            </a:graphic>
+          </wp:inline>
+        </w:drawing>
+      </w:r>
+    </w:p>
+    <w:p>
+      <w:pPr>
+        <w:jc w:val="center"/>
+      </w:pPr>
+      <w:r>
+        <w:t>Figure 7. Integrated computational profile of MDR_AI_030</w:t>
+      </w:r>
+    </w:p>
+    <w:p/>
+    <w:p>
+      <w:r>
+        <w:t>Figure 7. Scaled summary profile for MDR_AI_030, integrating QED, off-target selectivity, MD stability proxy, persistent hydrogen bonding, and quantum band-gap descriptors.</w:t>
       </w:r>
     </w:p>
     <w:p/>

</xml_diff>

<commit_message>
Refine workflow figure layout
</commit_message>
<xml_diff>
--- a/outputs/submission/submission_manuscript.docx
+++ b/outputs/submission/submission_manuscript.docx
@@ -159,7 +159,7 @@
       <w:r>
         <w:drawing>
           <wp:inline xmlns:a="http://schemas.openxmlformats.org/drawingml/2006/main" xmlns:pic="http://schemas.openxmlformats.org/drawingml/2006/picture">
-            <wp:extent cx="5669280" cy="1865314"/>
+            <wp:extent cx="5669280" cy="2812408"/>
             <wp:docPr id="1" name="Picture 1"/>
             <wp:cNvGraphicFramePr>
               <a:graphicFrameLocks noChangeAspect="1"/>
@@ -180,7 +180,7 @@
                   <pic:spPr>
                     <a:xfrm>
                       <a:off x="0" y="0"/>
-                      <a:ext cx="5669280" cy="1865314"/>
+                      <a:ext cx="5669280" cy="2812408"/>
                     </a:xfrm>
                     <a:prstGeom prst="rect"/>
                   </pic:spPr>

</xml_diff>

<commit_message>
Polish manuscript figures and audit outputs
</commit_message>
<xml_diff>
--- a/outputs/submission/submission_manuscript.docx
+++ b/outputs/submission/submission_manuscript.docx
@@ -159,7 +159,7 @@
       <w:r>
         <w:drawing>
           <wp:inline xmlns:a="http://schemas.openxmlformats.org/drawingml/2006/main" xmlns:pic="http://schemas.openxmlformats.org/drawingml/2006/picture">
-            <wp:extent cx="5669280" cy="2812408"/>
+            <wp:extent cx="5669280" cy="8033730"/>
             <wp:docPr id="1" name="Picture 1"/>
             <wp:cNvGraphicFramePr>
               <a:graphicFrameLocks noChangeAspect="1"/>
@@ -180,7 +180,7 @@
                   <pic:spPr>
                     <a:xfrm>
                       <a:off x="0" y="0"/>
-                      <a:ext cx="5669280" cy="2812408"/>
+                      <a:ext cx="5669280" cy="8033730"/>
                     </a:xfrm>
                     <a:prstGeom prst="rect"/>
                   </pic:spPr>
@@ -447,13 +447,67 @@
     <w:p/>
     <w:p>
       <w:r>
-        <w:t>The omics module identified 426 significant differential-expression events across 5,000 genes. The top five exported pathway scores were mtu00010_Glycolysis (8.6509), mtu00020_TCA_cycle (3.7137), mtu00190_Oxidative_phosphorylation (2.9899), mtu00230_Purine_metabolism (2.8079), and mtu00240_Pyrimidine_metabolism (2.4112). These outputs suggest a metabolically perturbed state in the current computational run and provide a disease-context backdrop for downstream prioritization.</w:t>
+        <w:t>The omics module identified 426 significant differential-expression events across 5,000 genes. The top five exported pathway scores were mtu00010_Glycolysis (8.6509), mtu00020_TCA_cycle (3.7137), mtu00190_Oxidative_phosphorylation (2.9899), mtu00230_Purine_metabolism (2.8079), and mtu00240_Pyrimidine_metabolism (2.4112). These outputs define the dominant metabolic signal within the current computational run and provide a disease-context backdrop for downstream prioritization.</w:t>
+      </w:r>
+    </w:p>
+    <w:p/>
+    <w:p>
+      <w:pPr>
+        <w:jc w:val="center"/>
+      </w:pPr>
+      <w:r>
+        <w:drawing>
+          <wp:inline xmlns:a="http://schemas.openxmlformats.org/drawingml/2006/main" xmlns:pic="http://schemas.openxmlformats.org/drawingml/2006/picture">
+            <wp:extent cx="5669280" cy="3130004"/>
+            <wp:docPr id="2" name="Picture 2"/>
+            <wp:cNvGraphicFramePr>
+              <a:graphicFrameLocks noChangeAspect="1"/>
+            </wp:cNvGraphicFramePr>
+            <a:graphic>
+              <a:graphicData uri="http://schemas.openxmlformats.org/drawingml/2006/picture">
+                <pic:pic>
+                  <pic:nvPicPr>
+                    <pic:cNvPr id="0" name="figure_4_pathways.png"/>
+                    <pic:cNvPicPr/>
+                  </pic:nvPicPr>
+                  <pic:blipFill>
+                    <a:blip r:embed="rId10"/>
+                    <a:stretch>
+                      <a:fillRect/>
+                    </a:stretch>
+                  </pic:blipFill>
+                  <pic:spPr>
+                    <a:xfrm>
+                      <a:off x="0" y="0"/>
+                      <a:ext cx="5669280" cy="3130004"/>
+                    </a:xfrm>
+                    <a:prstGeom prst="rect"/>
+                  </pic:spPr>
+                </pic:pic>
+              </a:graphicData>
+            </a:graphic>
+          </wp:inline>
+        </w:drawing>
+      </w:r>
+    </w:p>
+    <w:p>
+      <w:pPr>
+        <w:jc w:val="center"/>
+      </w:pPr>
+      <w:r>
+        <w:t>Figure 4. Top enriched pathways in the omics module</w:t>
       </w:r>
     </w:p>
     <w:p/>
     <w:p>
       <w:r>
-        <w:t>The epidemiology summary contextualized these results within a region-level trend analysis covering 2015-2023. The overall incidence trend was reported as decreasing, whereas the MDR-TB trend was rising. Rajasthan emerged as the highest-burden region in the current run, and the mean MDR-TB proportion across the analyzed regional set was 8.75%. Although these values are not used as causal inputs to compound-level scoring, they reinforce the rationale for emphasizing resistance-aware discovery.</w:t>
+        <w:t>Figure 4. Top enriched pathways from the omics module, highlighting glycolysis and related metabolic processes in the current computational run.</w:t>
+      </w:r>
+    </w:p>
+    <w:p/>
+    <w:p>
+      <w:r>
+        <w:t>The epidemiology summary contextualized these results within a region-level trend analysis covering 2015-2023. The overall incidence trend was reported as decreasing, whereas the MDR-TB trend was rising. The exported epidemiology summary identified Rajasthan as the highest overall burden region, whereas the MDR-specific pattern table showed the highest latest MDR-TB percentage in Madhya Pradesh. The mean MDR-TB proportion across the analyzed regional set was 8.75%. Although these values are not used as causal inputs to compound-level scoring, they reinforce the rationale for emphasizing resistance-aware discovery.</w:t>
       </w:r>
     </w:p>
     <w:p/>
@@ -465,7 +519,7 @@
         <w:drawing>
           <wp:inline xmlns:a="http://schemas.openxmlformats.org/drawingml/2006/main" xmlns:pic="http://schemas.openxmlformats.org/drawingml/2006/picture">
             <wp:extent cx="5669280" cy="3120120"/>
-            <wp:docPr id="2" name="Picture 2"/>
+            <wp:docPr id="3" name="Picture 3"/>
             <wp:cNvGraphicFramePr>
               <a:graphicFrameLocks noChangeAspect="1"/>
             </wp:cNvGraphicFramePr>
@@ -477,7 +531,7 @@
                     <pic:cNvPicPr/>
                   </pic:nvPicPr>
                   <pic:blipFill>
-                    <a:blip r:embed="rId10"/>
+                    <a:blip r:embed="rId11"/>
                     <a:stretch>
                       <a:fillRect/>
                     </a:stretch>
@@ -541,7 +595,7 @@
         <w:drawing>
           <wp:inline xmlns:a="http://schemas.openxmlformats.org/drawingml/2006/main" xmlns:pic="http://schemas.openxmlformats.org/drawingml/2006/picture">
             <wp:extent cx="5669280" cy="3523565"/>
-            <wp:docPr id="3" name="Picture 3"/>
+            <wp:docPr id="4" name="Picture 4"/>
             <wp:cNvGraphicFramePr>
               <a:graphicFrameLocks noChangeAspect="1"/>
             </wp:cNvGraphicFramePr>
@@ -553,7 +607,7 @@
                     <pic:cNvPicPr/>
                   </pic:nvPicPr>
                   <pic:blipFill>
-                    <a:blip r:embed="rId11"/>
+                    <a:blip r:embed="rId12"/>
                     <a:stretch>
                       <a:fillRect/>
                     </a:stretch>
@@ -945,60 +999,6 @@
     <w:p>
       <w:r>
         <w:t>Docking results against InhA showed a leading cluster of compounds with substantially stronger predicted affinities than the repeated -4.0 kcal/mol plateau seen among many lower-ranked compounds. The top 10 docked compounds are shown in Table 2.</w:t>
-      </w:r>
-    </w:p>
-    <w:p/>
-    <w:p>
-      <w:pPr>
-        <w:jc w:val="center"/>
-      </w:pPr>
-      <w:r>
-        <w:drawing>
-          <wp:inline xmlns:a="http://schemas.openxmlformats.org/drawingml/2006/main" xmlns:pic="http://schemas.openxmlformats.org/drawingml/2006/picture">
-            <wp:extent cx="5669280" cy="3130004"/>
-            <wp:docPr id="4" name="Picture 4"/>
-            <wp:cNvGraphicFramePr>
-              <a:graphicFrameLocks noChangeAspect="1"/>
-            </wp:cNvGraphicFramePr>
-            <a:graphic>
-              <a:graphicData uri="http://schemas.openxmlformats.org/drawingml/2006/picture">
-                <pic:pic>
-                  <pic:nvPicPr>
-                    <pic:cNvPr id="0" name="figure_4_pathways.png"/>
-                    <pic:cNvPicPr/>
-                  </pic:nvPicPr>
-                  <pic:blipFill>
-                    <a:blip r:embed="rId12"/>
-                    <a:stretch>
-                      <a:fillRect/>
-                    </a:stretch>
-                  </pic:blipFill>
-                  <pic:spPr>
-                    <a:xfrm>
-                      <a:off x="0" y="0"/>
-                      <a:ext cx="5669280" cy="3130004"/>
-                    </a:xfrm>
-                    <a:prstGeom prst="rect"/>
-                  </pic:spPr>
-                </pic:pic>
-              </a:graphicData>
-            </a:graphic>
-          </wp:inline>
-        </w:drawing>
-      </w:r>
-    </w:p>
-    <w:p>
-      <w:pPr>
-        <w:jc w:val="center"/>
-      </w:pPr>
-      <w:r>
-        <w:t>Figure 4. Top enriched pathways in the omics module</w:t>
-      </w:r>
-    </w:p>
-    <w:p/>
-    <w:p>
-      <w:r>
-        <w:t>Figure 4. Top enriched pathways from the omics module, highlighting glycolysis and related metabolic processes in the current computational run.</w:t>
       </w:r>
     </w:p>
     <w:p/>
@@ -1745,7 +1745,7 @@
     <w:p/>
     <w:p>
       <w:r>
-        <w:t>Figure 6. Two-dimensional molecular structure renderings for selected top valid de novo compounds identified in the ranking workflow (MDR_AI_030, MDR_AI_039, MDR_AI_047, MDR_AI_005, MDR_AI_026, and MDR_AI_042).</w:t>
+        <w:t>Figure 6. Two-dimensional molecular structure renderings for selected top RDKit-valid de novo compounds identified in the ranking workflow (MDR_AI_030, MDR_AI_039, MDR_AI_047, MDR_AI_005, MDR_AI_026, and MDR_AI_042). Compounds with malformed or unsupported SMILES were excluded from rendering rather than redrawn manually.</w:t>
       </w:r>
     </w:p>
     <w:p/>
@@ -2380,7 +2380,7 @@
     <w:p/>
     <w:p>
       <w:r>
-        <w:t>Another important point is the role of fallback or simulated data. The current project architecture allows progress even when complete live datasets are unavailable, which is useful for workflow demonstration and software validation. However, it also means that biological realism depends on upstream data availability and quality. This limitation must be made explicit rather than hidden behind overstated prose.</w:t>
+        <w:t>Another important point is the role of fallback or simulated data. The current project architecture allows progress even when complete live datasets are unavailable, which is useful for workflow demonstration and software validation. However, it also means that biological realism depends on upstream data availability and quality. In practical terms, pathway-level biology, ranking behavior, and downstream prioritization should be interpreted as outputs of the configured computational environment, not as stand-alone evidence of in vivo mechanism.</w:t>
       </w:r>
     </w:p>
     <w:p/>
@@ -2408,7 +2408,7 @@
     <w:p/>
     <w:p>
       <w:r>
-        <w:t>This work has several limitations. First, the workflow can operate with simulated or fallback data, so the biological realism of some upstream components is limited by data availability. Second, several modules are heuristic or proxy-based rather than full experimental or high-fidelity computational replacements. Third, the study does not include external prospective validation against independent MDR-TB screening datasets. Fourth, no wet-lab synthesis, enzymatic assay, MIC testing, or cell-based validation was performed. Finally, despite being manuscript-ready in structure and traceability, the text should still undergo domain-expert review before formal submission.</w:t>
+        <w:t>This work has several limitations. First, the workflow can operate with simulated or fallback data, so the biological realism of some upstream components is limited by data availability. Second, several modules are heuristic or proxy-based rather than full experimental or high-fidelity computational replacements. Third, the ranked-compound table includes molecules whose SMILES are not consistently parseable across cheminformatics tooling, which affects descriptor completeness and limits structure rendering to the valid subset shown in Figure 6. Fourth, the study does not include external prospective validation against independent MDR-TB screening datasets. Fifth, no wet-lab synthesis, enzymatic assay, MIC testing, or cell-based validation was performed. Finally, despite being manuscript-ready in structure and traceability, the text should still undergo domain-expert review before formal submission.</w:t>
       </w:r>
     </w:p>
     <w:p/>
@@ -2464,7 +2464,7 @@
     <w:p/>
     <w:p>
       <w:r>
-        <w:t>Availability of data and materials: All reported values are traceable to saved output files in the project workspace, including outputs/docking/docking_results_InhA.csv, outputs/md_simulations/md_summary.csv, outputs/admet/admet_toxicity_report.csv, outputs/polypharmacology/human_offtarget_report.csv, outputs/quantum_mechanics/electronic_orbitals.csv, outputs/retrosynthesis/synthesis_routes.csv, outputs/targets/scored_targets.csv, outputs/ranking/ranked_compounds.csv, outputs/omics/omics_summary.json, and outputs/resistance/resistance_scores.csv.</w:t>
+        <w:t>Availability of data and materials: All reported values are traceable to saved output files in the project workspace, including outputs/docking/docking_results_InhA.csv, outputs/md_simulations/md_summary.csv, outputs/admet/admet_toxicity_report.csv, outputs/polypharmacology/human_offtarget_report.csv, outputs/quantum_mechanics/electronic_orbitals.csv, outputs/retrosynthesis/synthesis_routes.csv, outputs/targets/scored_targets.csv, outputs/ranking/ranked_compounds.csv, outputs/omics/omics_summary.json, outputs/omics/pathway_scores.csv, outputs/epi/epi_summary.json, outputs/epi/mdr_patterns.csv, outputs/models/ml_summary.json, outputs/models/model_comparison.csv, and outputs/resistance/resistance_scores.csv.</w:t>
       </w:r>
     </w:p>
     <w:p/>
@@ -2526,7 +2526,7 @@
     </w:p>
     <w:p>
       <w:r>
-        <w:t>3. Vilchèze C, Jacobs WR Jr. The mechanism of isoniazid killing: clarity through the scope of genetics. Annu Rev Microbiol. 2007;61:35-50.</w:t>
+        <w:t>3. Vilcheze C, Jacobs WR Jr. The mechanism of isoniazid killing: clarity through the scope of genetics. Annu Rev Microbiol. 2007;61:35-50.</w:t>
       </w:r>
     </w:p>
     <w:p>

</xml_diff>

<commit_message>
Redesign Figure 1, fix figure numbering, and rebuild submission package
- Replaced simple 8-step vertical flowchart with an innovative 5-phase
  horizontal pipeline diagram (18x10.5 in, color-coded phases, module
  boxes with key metrics, inter-phase arrows, funnel summary strip)
- Fixed sequential figure numbering: Pathways → Fig 2, MDR patterns → Fig 3,
  Target ranking → Fig 4 (was out of order in prior version)
- Removed stale figure_2_target_ranking.png and figure_4_pathways.png;
  added figure_2_pathways.png and figure_4_target_ranking.png
- Updated figure references and captions in both manuscript_v7_final.md
  and manuscript_imrad.md to match corrected numbering
- Regenerated all 7 figures at 300 DPI; rebuilt submission DOCX assets

Co-Authored-By: Claude Sonnet 4.6 <noreply@anthropic.com>
</commit_message>
<xml_diff>
--- a/outputs/submission/submission_manuscript.docx
+++ b/outputs/submission/submission_manuscript.docx
@@ -159,7 +159,7 @@
       <w:r>
         <w:drawing>
           <wp:inline xmlns:a="http://schemas.openxmlformats.org/drawingml/2006/main" xmlns:pic="http://schemas.openxmlformats.org/drawingml/2006/picture">
-            <wp:extent cx="5669280" cy="8033730"/>
+            <wp:extent cx="5669280" cy="3284719"/>
             <wp:docPr id="1" name="Picture 1"/>
             <wp:cNvGraphicFramePr>
               <a:graphicFrameLocks noChangeAspect="1"/>
@@ -180,7 +180,7 @@
                   <pic:spPr>
                     <a:xfrm>
                       <a:off x="0" y="0"/>
-                      <a:ext cx="5669280" cy="8033730"/>
+                      <a:ext cx="5669280" cy="3284719"/>
                     </a:xfrm>
                     <a:prstGeom prst="rect"/>
                   </pic:spPr>
@@ -458,7 +458,7 @@
       <w:r>
         <w:drawing>
           <wp:inline xmlns:a="http://schemas.openxmlformats.org/drawingml/2006/main" xmlns:pic="http://schemas.openxmlformats.org/drawingml/2006/picture">
-            <wp:extent cx="5669280" cy="3130004"/>
+            <wp:extent cx="5669280" cy="3486990"/>
             <wp:docPr id="2" name="Picture 2"/>
             <wp:cNvGraphicFramePr>
               <a:graphicFrameLocks noChangeAspect="1"/>
@@ -467,7 +467,7 @@
               <a:graphicData uri="http://schemas.openxmlformats.org/drawingml/2006/picture">
                 <pic:pic>
                   <pic:nvPicPr>
-                    <pic:cNvPr id="0" name="figure_4_pathways.png"/>
+                    <pic:cNvPr id="0" name="figure_2_pathways.png"/>
                     <pic:cNvPicPr/>
                   </pic:nvPicPr>
                   <pic:blipFill>
@@ -479,7 +479,7 @@
                   <pic:spPr>
                     <a:xfrm>
                       <a:off x="0" y="0"/>
-                      <a:ext cx="5669280" cy="3130004"/>
+                      <a:ext cx="5669280" cy="3486990"/>
                     </a:xfrm>
                     <a:prstGeom prst="rect"/>
                   </pic:spPr>
@@ -495,13 +495,13 @@
         <w:jc w:val="center"/>
       </w:pPr>
       <w:r>
-        <w:t>Figure 4. Top enriched pathways in the omics module</w:t>
+        <w:t>Figure 2. Top enriched pathways in the omics module</w:t>
       </w:r>
     </w:p>
     <w:p/>
     <w:p>
       <w:r>
-        <w:t>Figure 4. Top enriched pathways from the omics module, highlighting glycolysis and related metabolic processes in the current computational run.</w:t>
+        <w:t>Figure 2. Top enriched pathways from the omics module, highlighting glycolysis and related metabolic processes in the current computational run.</w:t>
       </w:r>
     </w:p>
     <w:p/>
@@ -518,7 +518,7 @@
       <w:r>
         <w:drawing>
           <wp:inline xmlns:a="http://schemas.openxmlformats.org/drawingml/2006/main" xmlns:pic="http://schemas.openxmlformats.org/drawingml/2006/picture">
-            <wp:extent cx="5669280" cy="3120120"/>
+            <wp:extent cx="5669280" cy="3567212"/>
             <wp:docPr id="3" name="Picture 3"/>
             <wp:cNvGraphicFramePr>
               <a:graphicFrameLocks noChangeAspect="1"/>
@@ -539,7 +539,7 @@
                   <pic:spPr>
                     <a:xfrm>
                       <a:off x="0" y="0"/>
-                      <a:ext cx="5669280" cy="3120120"/>
+                      <a:ext cx="5669280" cy="3567212"/>
                     </a:xfrm>
                     <a:prstGeom prst="rect"/>
                   </pic:spPr>
@@ -555,13 +555,13 @@
         <w:jc w:val="center"/>
       </w:pPr>
       <w:r>
-        <w:t>Figure 2. Regional MDR-TB burden patterns</w:t>
+        <w:t>Figure 3. Regional MDR-TB burden patterns</w:t>
       </w:r>
     </w:p>
     <w:p/>
     <w:p>
       <w:r>
-        <w:t>Figure 2. Regional MDR-TB burden patterns derived from the epidemiology module, showing latest MDR-TB percentage across analyzed regions.</w:t>
+        <w:t>Figure 3. Regional MDR-TB burden patterns derived from the epidemiology module, showing latest MDR-TB percentage across analyzed regions.</w:t>
       </w:r>
     </w:p>
     <w:p/>
@@ -594,7 +594,7 @@
       <w:r>
         <w:drawing>
           <wp:inline xmlns:a="http://schemas.openxmlformats.org/drawingml/2006/main" xmlns:pic="http://schemas.openxmlformats.org/drawingml/2006/picture">
-            <wp:extent cx="5669280" cy="3523565"/>
+            <wp:extent cx="5669280" cy="3624290"/>
             <wp:docPr id="4" name="Picture 4"/>
             <wp:cNvGraphicFramePr>
               <a:graphicFrameLocks noChangeAspect="1"/>
@@ -603,7 +603,7 @@
               <a:graphicData uri="http://schemas.openxmlformats.org/drawingml/2006/picture">
                 <pic:pic>
                   <pic:nvPicPr>
-                    <pic:cNvPr id="0" name="figure_2_target_ranking.png"/>
+                    <pic:cNvPr id="0" name="figure_4_target_ranking.png"/>
                     <pic:cNvPicPr/>
                   </pic:nvPicPr>
                   <pic:blipFill>
@@ -615,7 +615,7 @@
                   <pic:spPr>
                     <a:xfrm>
                       <a:off x="0" y="0"/>
-                      <a:ext cx="5669280" cy="3523565"/>
+                      <a:ext cx="5669280" cy="3624290"/>
                     </a:xfrm>
                     <a:prstGeom prst="rect"/>
                   </pic:spPr>
@@ -631,13 +631,13 @@
         <w:jc w:val="center"/>
       </w:pPr>
       <w:r>
-        <w:t>Figure 3. Top-ranked TB drug targets</w:t>
+        <w:t>Figure 4. Top-ranked TB drug targets</w:t>
       </w:r>
     </w:p>
     <w:p/>
     <w:p>
       <w:r>
-        <w:t>Figure 3. Horizontal ranking of the top prioritized TB drug targets based on the exported multi-factor scoring table.</w:t>
+        <w:t>Figure 4. Horizontal ranking of the top prioritized TB drug targets based on the exported multi-factor scoring table.</w:t>
       </w:r>
     </w:p>
     <w:p/>
@@ -1009,7 +1009,7 @@
       <w:r>
         <w:drawing>
           <wp:inline xmlns:a="http://schemas.openxmlformats.org/drawingml/2006/main" xmlns:pic="http://schemas.openxmlformats.org/drawingml/2006/picture">
-            <wp:extent cx="5669280" cy="3128831"/>
+            <wp:extent cx="5669280" cy="3487807"/>
             <wp:docPr id="5" name="Picture 5"/>
             <wp:cNvGraphicFramePr>
               <a:graphicFrameLocks noChangeAspect="1"/>
@@ -1030,7 +1030,7 @@
                   <pic:spPr>
                     <a:xfrm>
                       <a:off x="0" y="0"/>
-                      <a:ext cx="5669280" cy="3128831"/>
+                      <a:ext cx="5669280" cy="3487807"/>
                     </a:xfrm>
                     <a:prstGeom prst="rect"/>
                   </pic:spPr>
@@ -2015,7 +2015,7 @@
       <w:r>
         <w:drawing>
           <wp:inline xmlns:a="http://schemas.openxmlformats.org/drawingml/2006/main" xmlns:pic="http://schemas.openxmlformats.org/drawingml/2006/picture">
-            <wp:extent cx="5669280" cy="3617175"/>
+            <wp:extent cx="5669280" cy="3597496"/>
             <wp:docPr id="7" name="Picture 7"/>
             <wp:cNvGraphicFramePr>
               <a:graphicFrameLocks noChangeAspect="1"/>
@@ -2036,7 +2036,7 @@
                   <pic:spPr>
                     <a:xfrm>
                       <a:off x="0" y="0"/>
-                      <a:ext cx="5669280" cy="3617175"/>
+                      <a:ext cx="5669280" cy="3597496"/>
                     </a:xfrm>
                     <a:prstGeom prst="rect"/>
                   </pic:spPr>

</xml_diff>